<commit_message>
7 casos de uso completos rapsody
</commit_message>
<xml_diff>
--- a/3_SISTEMA/ECU_C1_Generar_Boleta_en_Orden.docx
+++ b/3_SISTEMA/ECU_C1_Generar_Boleta_en_Orden.docx
@@ -987,17 +987,9 @@
           <w:sz w:val="24"/>
           <w:szCs w:val="24"/>
         </w:rPr>
-        <w:t>Tecnico</w:t>
+        <w:t>Recepcionista</w:t>
       </w:r>
       <w:proofErr w:type="spellEnd"/>
-      <w:r>
-        <w:rPr>
-          <w:rFonts w:ascii="Arial" w:hAnsi="Arial" w:cs="Arial"/>
-          <w:sz w:val="24"/>
-          <w:szCs w:val="24"/>
-        </w:rPr>
-        <w:t xml:space="preserve"> </w:t>
-      </w:r>
     </w:p>
     <w:p>
       <w:pPr>
@@ -1104,7 +1096,7 @@
           <w:sz w:val="24"/>
           <w:szCs w:val="24"/>
         </w:rPr>
-        <w:t>Tecnico</w:t>
+        <w:t>Recepcionista</w:t>
       </w:r>
       <w:proofErr w:type="spellEnd"/>
       <w:r>
@@ -1113,6 +1105,24 @@
           <w:sz w:val="24"/>
           <w:szCs w:val="24"/>
         </w:rPr>
+        <w:t xml:space="preserve"> se </w:t>
+      </w:r>
+      <w:proofErr w:type="spellStart"/>
+      <w:r>
+        <w:rPr>
+          <w:rFonts w:ascii="Arial" w:hAnsi="Arial" w:cs="Arial"/>
+          <w:sz w:val="24"/>
+          <w:szCs w:val="24"/>
+        </w:rPr>
+        <w:t>encuentra</w:t>
+      </w:r>
+      <w:proofErr w:type="spellEnd"/>
+      <w:r>
+        <w:rPr>
+          <w:rFonts w:ascii="Arial" w:hAnsi="Arial" w:cs="Arial"/>
+          <w:sz w:val="24"/>
+          <w:szCs w:val="24"/>
+        </w:rPr>
         <w:t xml:space="preserve"> </w:t>
       </w:r>
       <w:proofErr w:type="spellStart"/>
@@ -1122,7 +1132,7 @@
           <w:sz w:val="24"/>
           <w:szCs w:val="24"/>
         </w:rPr>
-        <w:t>Registra</w:t>
+        <w:t>en</w:t>
       </w:r>
       <w:proofErr w:type="spellEnd"/>
       <w:r>
@@ -1131,7 +1141,7 @@
           <w:sz w:val="24"/>
           <w:szCs w:val="24"/>
         </w:rPr>
-        <w:t xml:space="preserve"> </w:t>
+        <w:t xml:space="preserve"> la </w:t>
       </w:r>
       <w:proofErr w:type="spellStart"/>
       <w:r>
@@ -1140,7 +1150,7 @@
           <w:sz w:val="24"/>
           <w:szCs w:val="24"/>
         </w:rPr>
-        <w:t>orden</w:t>
+        <w:t>Interfaz</w:t>
       </w:r>
       <w:proofErr w:type="spellEnd"/>
       <w:r>
@@ -1149,25 +1159,7 @@
           <w:sz w:val="24"/>
           <w:szCs w:val="24"/>
         </w:rPr>
-        <w:t xml:space="preserve"> de </w:t>
-      </w:r>
-      <w:proofErr w:type="spellStart"/>
-      <w:r>
-        <w:rPr>
-          <w:rFonts w:ascii="Arial" w:hAnsi="Arial" w:cs="Arial"/>
-          <w:sz w:val="24"/>
-          <w:szCs w:val="24"/>
-        </w:rPr>
-        <w:t>servicio</w:t>
-      </w:r>
-      <w:proofErr w:type="spellEnd"/>
-      <w:r>
-        <w:rPr>
-          <w:rFonts w:ascii="Arial" w:hAnsi="Arial" w:cs="Arial"/>
-          <w:sz w:val="24"/>
-          <w:szCs w:val="24"/>
-        </w:rPr>
-        <w:t xml:space="preserve">. </w:t>
+        <w:t xml:space="preserve"> Registrar Orden.</w:t>
       </w:r>
     </w:p>
     <w:p>
@@ -1184,14 +1176,6 @@
           <w:szCs w:val="24"/>
         </w:rPr>
       </w:pPr>
-      <w:r>
-        <w:rPr>
-          <w:rFonts w:ascii="Arial" w:hAnsi="Arial" w:cs="Arial"/>
-          <w:sz w:val="24"/>
-          <w:szCs w:val="24"/>
-        </w:rPr>
-        <w:t xml:space="preserve">El Sistema </w:t>
-      </w:r>
       <w:proofErr w:type="spellStart"/>
       <w:r>
         <w:rPr>
@@ -1199,7 +1183,7 @@
           <w:sz w:val="24"/>
           <w:szCs w:val="24"/>
         </w:rPr>
-        <w:t>lista</w:t>
+        <w:t>Recepcionista</w:t>
       </w:r>
       <w:proofErr w:type="spellEnd"/>
       <w:r>
@@ -1217,7 +1201,7 @@
           <w:sz w:val="24"/>
           <w:szCs w:val="24"/>
         </w:rPr>
-        <w:t>los</w:t>
+        <w:t>selecciona</w:t>
       </w:r>
       <w:proofErr w:type="spellEnd"/>
       <w:r>
@@ -1235,7 +1219,7 @@
           <w:sz w:val="24"/>
           <w:szCs w:val="24"/>
         </w:rPr>
-        <w:t>datos</w:t>
+        <w:t>Generar</w:t>
       </w:r>
       <w:proofErr w:type="spellEnd"/>
       <w:r>
@@ -1253,7 +1237,7 @@
           <w:sz w:val="24"/>
           <w:szCs w:val="24"/>
         </w:rPr>
-        <w:t>registrados</w:t>
+        <w:t>Boleta</w:t>
       </w:r>
       <w:proofErr w:type="spellEnd"/>
       <w:r>
@@ -1262,7 +1246,7 @@
           <w:sz w:val="24"/>
           <w:szCs w:val="24"/>
         </w:rPr>
-        <w:t xml:space="preserve">. </w:t>
+        <w:t xml:space="preserve"> de Orden.</w:t>
       </w:r>
     </w:p>
     <w:p>
@@ -1279,6 +1263,14 @@
           <w:szCs w:val="24"/>
         </w:rPr>
       </w:pPr>
+      <w:r>
+        <w:rPr>
+          <w:rFonts w:ascii="Arial" w:hAnsi="Arial" w:cs="Arial"/>
+          <w:sz w:val="24"/>
+          <w:szCs w:val="24"/>
+        </w:rPr>
+        <w:t xml:space="preserve">El Sistema </w:t>
+      </w:r>
       <w:proofErr w:type="spellStart"/>
       <w:r>
         <w:rPr>
@@ -1286,7 +1278,7 @@
           <w:sz w:val="24"/>
           <w:szCs w:val="24"/>
         </w:rPr>
-        <w:t>Tecnico</w:t>
+        <w:t>lista</w:t>
       </w:r>
       <w:proofErr w:type="spellEnd"/>
       <w:r>
@@ -1304,7 +1296,7 @@
           <w:sz w:val="24"/>
           <w:szCs w:val="24"/>
         </w:rPr>
-        <w:t>revisa</w:t>
+        <w:t>los</w:t>
       </w:r>
       <w:proofErr w:type="spellEnd"/>
       <w:r>
@@ -1322,7 +1314,7 @@
           <w:sz w:val="24"/>
           <w:szCs w:val="24"/>
         </w:rPr>
-        <w:t>los</w:t>
+        <w:t>datos</w:t>
       </w:r>
       <w:proofErr w:type="spellEnd"/>
       <w:r>
@@ -1340,97 +1332,7 @@
           <w:sz w:val="24"/>
           <w:szCs w:val="24"/>
         </w:rPr>
-        <w:t>datos</w:t>
-      </w:r>
-      <w:proofErr w:type="spellEnd"/>
-      <w:r>
-        <w:rPr>
-          <w:rFonts w:ascii="Arial" w:hAnsi="Arial" w:cs="Arial"/>
-          <w:sz w:val="24"/>
-          <w:szCs w:val="24"/>
-        </w:rPr>
-        <w:t xml:space="preserve"> para </w:t>
-      </w:r>
-      <w:proofErr w:type="spellStart"/>
-      <w:r>
-        <w:rPr>
-          <w:rFonts w:ascii="Arial" w:hAnsi="Arial" w:cs="Arial"/>
-          <w:sz w:val="24"/>
-          <w:szCs w:val="24"/>
-        </w:rPr>
-        <w:t>comprobar</w:t>
-      </w:r>
-      <w:proofErr w:type="spellEnd"/>
-      <w:r>
-        <w:rPr>
-          <w:rFonts w:ascii="Arial" w:hAnsi="Arial" w:cs="Arial"/>
-          <w:sz w:val="24"/>
-          <w:szCs w:val="24"/>
-        </w:rPr>
-        <w:t xml:space="preserve"> </w:t>
-      </w:r>
-      <w:proofErr w:type="spellStart"/>
-      <w:r>
-        <w:rPr>
-          <w:rFonts w:ascii="Arial" w:hAnsi="Arial" w:cs="Arial"/>
-          <w:sz w:val="24"/>
-          <w:szCs w:val="24"/>
-        </w:rPr>
-        <w:t>si</w:t>
-      </w:r>
-      <w:proofErr w:type="spellEnd"/>
-      <w:r>
-        <w:rPr>
-          <w:rFonts w:ascii="Arial" w:hAnsi="Arial" w:cs="Arial"/>
-          <w:sz w:val="24"/>
-          <w:szCs w:val="24"/>
-        </w:rPr>
-        <w:t xml:space="preserve"> </w:t>
-      </w:r>
-      <w:proofErr w:type="spellStart"/>
-      <w:r>
-        <w:rPr>
-          <w:rFonts w:ascii="Arial" w:hAnsi="Arial" w:cs="Arial"/>
-          <w:sz w:val="24"/>
-          <w:szCs w:val="24"/>
-        </w:rPr>
-        <w:t>coinciden</w:t>
-      </w:r>
-      <w:proofErr w:type="spellEnd"/>
-      <w:r>
-        <w:rPr>
-          <w:rFonts w:ascii="Arial" w:hAnsi="Arial" w:cs="Arial"/>
-          <w:sz w:val="24"/>
-          <w:szCs w:val="24"/>
-        </w:rPr>
-        <w:t xml:space="preserve"> con </w:t>
-      </w:r>
-      <w:proofErr w:type="spellStart"/>
-      <w:r>
-        <w:rPr>
-          <w:rFonts w:ascii="Arial" w:hAnsi="Arial" w:cs="Arial"/>
-          <w:sz w:val="24"/>
-          <w:szCs w:val="24"/>
-        </w:rPr>
-        <w:t>los</w:t>
-      </w:r>
-      <w:proofErr w:type="spellEnd"/>
-      <w:r>
-        <w:rPr>
-          <w:rFonts w:ascii="Arial" w:hAnsi="Arial" w:cs="Arial"/>
-          <w:sz w:val="24"/>
-          <w:szCs w:val="24"/>
-        </w:rPr>
-        <w:t xml:space="preserve"> </w:t>
-      </w:r>
-      <w:proofErr w:type="spellStart"/>
-      <w:r>
-        <w:rPr>
-          <w:rFonts w:ascii="Arial" w:hAnsi="Arial" w:cs="Arial"/>
-          <w:sz w:val="24"/>
-          <w:szCs w:val="24"/>
-        </w:rPr>
-        <w:t>ingresados</w:t>
+        <w:t>registrados</w:t>
       </w:r>
       <w:proofErr w:type="spellEnd"/>
       <w:r>
@@ -1481,7 +1383,7 @@
           <w:sz w:val="24"/>
           <w:szCs w:val="24"/>
         </w:rPr>
-        <w:t>selecciona</w:t>
+        <w:t>revisa</w:t>
       </w:r>
       <w:proofErr w:type="spellEnd"/>
       <w:r>
@@ -1490,7 +1392,7 @@
           <w:sz w:val="24"/>
           <w:szCs w:val="24"/>
         </w:rPr>
-        <w:t xml:space="preserve"> “</w:t>
+        <w:t xml:space="preserve"> </w:t>
       </w:r>
       <w:proofErr w:type="spellStart"/>
       <w:r>
@@ -1499,7 +1401,7 @@
           <w:sz w:val="24"/>
           <w:szCs w:val="24"/>
         </w:rPr>
-        <w:t>guardar</w:t>
+        <w:t>los</w:t>
       </w:r>
       <w:proofErr w:type="spellEnd"/>
       <w:r>
@@ -1508,8 +1410,108 @@
           <w:sz w:val="24"/>
           <w:szCs w:val="24"/>
         </w:rPr>
-        <w:t>”</w:t>
-      </w:r>
+        <w:t xml:space="preserve"> </w:t>
+      </w:r>
+      <w:proofErr w:type="spellStart"/>
+      <w:r>
+        <w:rPr>
+          <w:rFonts w:ascii="Arial" w:hAnsi="Arial" w:cs="Arial"/>
+          <w:sz w:val="24"/>
+          <w:szCs w:val="24"/>
+        </w:rPr>
+        <w:t>datos</w:t>
+      </w:r>
+      <w:proofErr w:type="spellEnd"/>
+      <w:r>
+        <w:rPr>
+          <w:rFonts w:ascii="Arial" w:hAnsi="Arial" w:cs="Arial"/>
+          <w:sz w:val="24"/>
+          <w:szCs w:val="24"/>
+        </w:rPr>
+        <w:t xml:space="preserve"> para </w:t>
+      </w:r>
+      <w:proofErr w:type="spellStart"/>
+      <w:r>
+        <w:rPr>
+          <w:rFonts w:ascii="Arial" w:hAnsi="Arial" w:cs="Arial"/>
+          <w:sz w:val="24"/>
+          <w:szCs w:val="24"/>
+        </w:rPr>
+        <w:t>comprobar</w:t>
+      </w:r>
+      <w:proofErr w:type="spellEnd"/>
+      <w:r>
+        <w:rPr>
+          <w:rFonts w:ascii="Arial" w:hAnsi="Arial" w:cs="Arial"/>
+          <w:sz w:val="24"/>
+          <w:szCs w:val="24"/>
+        </w:rPr>
+        <w:t xml:space="preserve"> </w:t>
+      </w:r>
+      <w:proofErr w:type="spellStart"/>
+      <w:r>
+        <w:rPr>
+          <w:rFonts w:ascii="Arial" w:hAnsi="Arial" w:cs="Arial"/>
+          <w:sz w:val="24"/>
+          <w:szCs w:val="24"/>
+        </w:rPr>
+        <w:t>si</w:t>
+      </w:r>
+      <w:proofErr w:type="spellEnd"/>
+      <w:r>
+        <w:rPr>
+          <w:rFonts w:ascii="Arial" w:hAnsi="Arial" w:cs="Arial"/>
+          <w:sz w:val="24"/>
+          <w:szCs w:val="24"/>
+        </w:rPr>
+        <w:t xml:space="preserve"> </w:t>
+      </w:r>
+      <w:proofErr w:type="spellStart"/>
+      <w:r>
+        <w:rPr>
+          <w:rFonts w:ascii="Arial" w:hAnsi="Arial" w:cs="Arial"/>
+          <w:sz w:val="24"/>
+          <w:szCs w:val="24"/>
+        </w:rPr>
+        <w:t>coinciden</w:t>
+      </w:r>
+      <w:proofErr w:type="spellEnd"/>
+      <w:r>
+        <w:rPr>
+          <w:rFonts w:ascii="Arial" w:hAnsi="Arial" w:cs="Arial"/>
+          <w:sz w:val="24"/>
+          <w:szCs w:val="24"/>
+        </w:rPr>
+        <w:t xml:space="preserve"> con </w:t>
+      </w:r>
+      <w:proofErr w:type="spellStart"/>
+      <w:r>
+        <w:rPr>
+          <w:rFonts w:ascii="Arial" w:hAnsi="Arial" w:cs="Arial"/>
+          <w:sz w:val="24"/>
+          <w:szCs w:val="24"/>
+        </w:rPr>
+        <w:t>los</w:t>
+      </w:r>
+      <w:proofErr w:type="spellEnd"/>
+      <w:r>
+        <w:rPr>
+          <w:rFonts w:ascii="Arial" w:hAnsi="Arial" w:cs="Arial"/>
+          <w:sz w:val="24"/>
+          <w:szCs w:val="24"/>
+        </w:rPr>
+        <w:t xml:space="preserve"> </w:t>
+      </w:r>
+      <w:proofErr w:type="spellStart"/>
+      <w:r>
+        <w:rPr>
+          <w:rFonts w:ascii="Arial" w:hAnsi="Arial" w:cs="Arial"/>
+          <w:sz w:val="24"/>
+          <w:szCs w:val="24"/>
+        </w:rPr>
+        <w:t>ingresados</w:t>
+      </w:r>
+      <w:proofErr w:type="spellEnd"/>
       <w:r>
         <w:rPr>
           <w:rFonts w:ascii="Arial" w:hAnsi="Arial" w:cs="Arial"/>
@@ -1533,14 +1535,6 @@
           <w:szCs w:val="24"/>
         </w:rPr>
       </w:pPr>
-      <w:r>
-        <w:rPr>
-          <w:rFonts w:ascii="Arial" w:hAnsi="Arial" w:cs="Arial"/>
-          <w:sz w:val="24"/>
-          <w:szCs w:val="24"/>
-        </w:rPr>
-        <w:t xml:space="preserve">El </w:t>
-      </w:r>
       <w:proofErr w:type="spellStart"/>
       <w:r>
         <w:rPr>
@@ -1548,7 +1542,7 @@
           <w:sz w:val="24"/>
           <w:szCs w:val="24"/>
         </w:rPr>
-        <w:t>sistema</w:t>
+        <w:t>Tecnico</w:t>
       </w:r>
       <w:proofErr w:type="spellEnd"/>
       <w:r>
@@ -1566,7 +1560,7 @@
           <w:sz w:val="24"/>
           <w:szCs w:val="24"/>
         </w:rPr>
-        <w:t>guarda</w:t>
+        <w:t>selecciona</w:t>
       </w:r>
       <w:proofErr w:type="spellEnd"/>
       <w:r>
@@ -1575,7 +1569,7 @@
           <w:sz w:val="24"/>
           <w:szCs w:val="24"/>
         </w:rPr>
-        <w:t xml:space="preserve"> la </w:t>
+        <w:t xml:space="preserve"> “</w:t>
       </w:r>
       <w:proofErr w:type="spellStart"/>
       <w:r>
@@ -1584,9 +1578,35 @@
           <w:sz w:val="24"/>
           <w:szCs w:val="24"/>
         </w:rPr>
-        <w:t>informacion</w:t>
+        <w:t>guardar</w:t>
       </w:r>
       <w:proofErr w:type="spellEnd"/>
+      <w:r>
+        <w:rPr>
+          <w:rFonts w:ascii="Arial" w:hAnsi="Arial" w:cs="Arial"/>
+          <w:sz w:val="24"/>
+          <w:szCs w:val="24"/>
+        </w:rPr>
+        <w:t xml:space="preserve"> </w:t>
+      </w:r>
+      <w:proofErr w:type="spellStart"/>
+      <w:r>
+        <w:rPr>
+          <w:rFonts w:ascii="Arial" w:hAnsi="Arial" w:cs="Arial"/>
+          <w:sz w:val="24"/>
+          <w:szCs w:val="24"/>
+        </w:rPr>
+        <w:t>archivo</w:t>
+      </w:r>
+      <w:proofErr w:type="spellEnd"/>
+      <w:r>
+        <w:rPr>
+          <w:rFonts w:ascii="Arial" w:hAnsi="Arial" w:cs="Arial"/>
+          <w:sz w:val="24"/>
+          <w:szCs w:val="24"/>
+        </w:rPr>
+        <w:t>”</w:t>
+      </w:r>
       <w:r>
         <w:rPr>
           <w:rFonts w:ascii="Arial" w:hAnsi="Arial" w:cs="Arial"/>
@@ -1616,6 +1636,83 @@
           <w:sz w:val="24"/>
           <w:szCs w:val="24"/>
         </w:rPr>
+        <w:t xml:space="preserve">El </w:t>
+      </w:r>
+      <w:proofErr w:type="spellStart"/>
+      <w:r>
+        <w:rPr>
+          <w:rFonts w:ascii="Arial" w:hAnsi="Arial" w:cs="Arial"/>
+          <w:sz w:val="24"/>
+          <w:szCs w:val="24"/>
+        </w:rPr>
+        <w:t>sistema</w:t>
+      </w:r>
+      <w:proofErr w:type="spellEnd"/>
+      <w:r>
+        <w:rPr>
+          <w:rFonts w:ascii="Arial" w:hAnsi="Arial" w:cs="Arial"/>
+          <w:sz w:val="24"/>
+          <w:szCs w:val="24"/>
+        </w:rPr>
+        <w:t xml:space="preserve"> </w:t>
+      </w:r>
+      <w:proofErr w:type="spellStart"/>
+      <w:r>
+        <w:rPr>
+          <w:rFonts w:ascii="Arial" w:hAnsi="Arial" w:cs="Arial"/>
+          <w:sz w:val="24"/>
+          <w:szCs w:val="24"/>
+        </w:rPr>
+        <w:t>guarda</w:t>
+      </w:r>
+      <w:proofErr w:type="spellEnd"/>
+      <w:r>
+        <w:rPr>
+          <w:rFonts w:ascii="Arial" w:hAnsi="Arial" w:cs="Arial"/>
+          <w:sz w:val="24"/>
+          <w:szCs w:val="24"/>
+        </w:rPr>
+        <w:t xml:space="preserve"> la </w:t>
+      </w:r>
+      <w:proofErr w:type="spellStart"/>
+      <w:r>
+        <w:rPr>
+          <w:rFonts w:ascii="Arial" w:hAnsi="Arial" w:cs="Arial"/>
+          <w:sz w:val="24"/>
+          <w:szCs w:val="24"/>
+        </w:rPr>
+        <w:t>informacion</w:t>
+      </w:r>
+      <w:proofErr w:type="spellEnd"/>
+      <w:r>
+        <w:rPr>
+          <w:rFonts w:ascii="Arial" w:hAnsi="Arial" w:cs="Arial"/>
+          <w:sz w:val="24"/>
+          <w:szCs w:val="24"/>
+        </w:rPr>
+        <w:t xml:space="preserve">. </w:t>
+      </w:r>
+    </w:p>
+    <w:p>
+      <w:pPr>
+        <w:widowControl/>
+        <w:numPr>
+          <w:ilvl w:val="0"/>
+          <w:numId w:val="41"/>
+        </w:numPr>
+        <w:spacing w:before="100" w:beforeAutospacing="1" w:after="100" w:afterAutospacing="1" w:line="240" w:lineRule="auto"/>
+        <w:rPr>
+          <w:rFonts w:ascii="Arial" w:hAnsi="Arial" w:cs="Arial"/>
+          <w:sz w:val="24"/>
+          <w:szCs w:val="24"/>
+        </w:rPr>
+      </w:pPr>
+      <w:r>
+        <w:rPr>
+          <w:rFonts w:ascii="Arial" w:hAnsi="Arial" w:cs="Arial"/>
+          <w:sz w:val="24"/>
+          <w:szCs w:val="24"/>
+        </w:rPr>
         <w:t xml:space="preserve">El Sistema genera la </w:t>
       </w:r>
       <w:proofErr w:type="spellStart"/>
@@ -2290,6 +2387,7 @@
           <w:sz w:val="24"/>
           <w:szCs w:val="24"/>
         </w:rPr>
+        <w:lastRenderedPageBreak/>
         <w:t xml:space="preserve">7. Puntos de </w:t>
       </w:r>
       <w:proofErr w:type="spellStart"/>
@@ -2351,7 +2449,6 @@
           <w:sz w:val="24"/>
           <w:szCs w:val="24"/>
         </w:rPr>
-        <w:lastRenderedPageBreak/>
         <w:t xml:space="preserve">8. </w:t>
       </w:r>
       <w:proofErr w:type="spellStart"/>

</xml_diff>